<commit_message>
Blog: Part 3 rewritten in the series voice, with analogies carrying the technical depth
The silicon design post now reads like Parts 1 and 2: first person, no em dashes,
one picture per idea (bank vault for the contract, castle walls for enforcement
domains, bar-code scanner for what a chip can know, warehouse doors for the data
path, box office and usher for authorize-reserve-commit, birth certificate and
odometer for the root of trust, security office and badge readers for the
controller and its enforcement points, courier signature for provenance). All
tables, figures, appendices and the experiment program are unchanged in substance.
Rebuilt the three .docx files.

Co-Authored-By: Claude Fable 5.1 <noreply@anthropic.com>
Claude-Session: https://claude.ai/code/session_01DkQpVYNjMdJtfzj74tR8ZC
</commit_message>
<xml_diff>
--- a/blog/03-the-chip-that-says-no-2-with-the-technical-detail.docx
+++ b/blog/03-the-chip-that-says-no-2-with-the-technical-detail.docx
@@ -837,7 +837,7 @@
       <w:r>
         <w:t xml:space="preserve">It builds on the layer model and the reference stack from </w:t>
       </w:r>
-      <w:hyperlink w:history="1" r:id="rId2kpkiqcr0pxypa_p-rk0m">
+      <w:hyperlink w:history="1" r:id="rIdvbhpfpnhm2zqdcwx0s2jv">
         <w:r>
           <w:rPr>
             <w:rStyle w:val="Hyperlink"/>
@@ -1006,7 +1006,7 @@
         </w:numPr>
         <w:spacing w:after="100" w:line="276" w:lineRule="auto"/>
       </w:pPr>
-      <w:hyperlink w:history="1" r:id="rIdelmqplua-gbq4nqdpfaee">
+      <w:hyperlink w:history="1" r:id="rIdo6bhhgtxf3wqsky-a_duj">
         <w:r>
           <w:rPr>
             <w:rStyle w:val="Hyperlink"/>

</xml_diff>